<commit_message>
docs: fill API design section in project report
- List all 4 GET endpoints with purpose, parameters, and response data
- Explain HTTP method choice (GET only for A2, POST/PUT/DELETE reserved for A3)
- Describe stateless REST principles
</commit_message>
<xml_diff>
--- a/docs/PROG2002 A2 Report.docx
+++ b/docs/PROG2002 A2 Report.docx
@@ -710,6 +710,144 @@
       </w:r>
     </w:p>
     <w:p/>
+    <w:p>
+      <w:pPr>
+        <w:spacing w:line="360" w:lineRule="auto"/>
+      </w:pPr>
+      <w:r>
+        <w:rPr>
+          <w:rFonts w:ascii="Arial" w:hAnsi="Arial"/>
+          <w:sz w:val="24"/>
+        </w:rPr>
+        <w:t>HTTP method choice: Only GET methods are used for Assessment 2 because the brief specifies that this assignment focuses on retrieving and displaying data. POST, PUT, and DELETE are reserved for Assessment 3 when data modification endpoints will be added. Using GET for read-only operations aligns with REST principles where the HTTP method reflects the operation type. The API is stateless — each request contains all information needed to process it, and the server does not store session state between requests.</w:t>
+      </w:r>
+    </w:p>
+    <w:p>
+      <w:pPr>
+        <w:spacing w:line="360" w:lineRule="auto"/>
+      </w:pPr>
+      <w:r>
+        <w:rPr>
+          <w:rFonts w:ascii="Arial" w:hAnsi="Arial"/>
+          <w:sz w:val="24"/>
+        </w:rPr>
+      </w:r>
+    </w:p>
+    <w:p>
+      <w:pPr>
+        <w:spacing w:line="360" w:lineRule="auto"/>
+      </w:pPr>
+      <w:r>
+        <w:rPr>
+          <w:rFonts w:ascii="Arial" w:hAnsi="Arial"/>
+          <w:sz w:val="24"/>
+        </w:rPr>
+        <w:t>GET /api/events/:id — Returns full details for a single event identified by its event_id. The response includes all event fields plus the hosting organisation details (org_name, org_description, contact_email, contact_phone) and a computed progress_percent field showing the percentage of the fundraising goal that has been reached. If the event does not exist or is suspended, a 404 Not Found error is returned.</w:t>
+      </w:r>
+    </w:p>
+    <w:p>
+      <w:pPr>
+        <w:spacing w:line="360" w:lineRule="auto"/>
+      </w:pPr>
+      <w:r>
+        <w:rPr>
+          <w:rFonts w:ascii="Arial" w:hAnsi="Arial"/>
+          <w:sz w:val="24"/>
+        </w:rPr>
+      </w:r>
+    </w:p>
+    <w:p>
+      <w:pPr>
+        <w:spacing w:line="360" w:lineRule="auto"/>
+      </w:pPr>
+      <w:r>
+        <w:rPr>
+          <w:rFonts w:ascii="Arial" w:hAnsi="Arial"/>
+          <w:sz w:val="24"/>
+        </w:rPr>
+        <w:t>GET /api/events/search?date=&amp;location=&amp;category= — Accepts optional query parameters for date, location, and category, allowing users to combine filters. The date parameter filters events occurring on or after the specified date. The location parameter performs a case-insensitive partial match. The category parameter matches the category_id foreign key. All filters are optional. Returns a JSON array of matching active events.</w:t>
+      </w:r>
+    </w:p>
+    <w:p>
+      <w:pPr>
+        <w:spacing w:line="360" w:lineRule="auto"/>
+      </w:pPr>
+      <w:r>
+        <w:rPr>
+          <w:rFonts w:ascii="Arial" w:hAnsi="Arial"/>
+          <w:sz w:val="24"/>
+        </w:rPr>
+      </w:r>
+    </w:p>
+    <w:p>
+      <w:pPr>
+        <w:spacing w:line="360" w:lineRule="auto"/>
+      </w:pPr>
+      <w:r>
+        <w:rPr>
+          <w:rFonts w:ascii="Arial" w:hAnsi="Arial"/>
+          <w:sz w:val="24"/>
+        </w:rPr>
+        <w:t>GET /api/categories — Returns all event categories for the search page dropdown. This endpoint returns category_id and category_name as a JSON array, ordered alphabetically.</w:t>
+      </w:r>
+    </w:p>
+    <w:p>
+      <w:pPr>
+        <w:spacing w:line="360" w:lineRule="auto"/>
+      </w:pPr>
+      <w:r>
+        <w:rPr>
+          <w:rFonts w:ascii="Arial" w:hAnsi="Arial"/>
+          <w:sz w:val="24"/>
+        </w:rPr>
+      </w:r>
+    </w:p>
+    <w:p>
+      <w:pPr>
+        <w:spacing w:line="360" w:lineRule="auto"/>
+      </w:pPr>
+      <w:r>
+        <w:rPr>
+          <w:rFonts w:ascii="Arial" w:hAnsi="Arial"/>
+          <w:sz w:val="24"/>
+        </w:rPr>
+        <w:t>GET /api/events — Returns all active and upcoming events for the home page. The query filters events where event_status = 'active' and event_date &gt;= CURDATE(), ordered by date and time. It returns a JSON array containing event_id, event_name, event_date, event_time, location, ticket_price, event_image, event_status, category_name, and org_name.</w:t>
+      </w:r>
+    </w:p>
+    <w:p>
+      <w:pPr>
+        <w:spacing w:line="360" w:lineRule="auto"/>
+      </w:pPr>
+      <w:r>
+        <w:rPr>
+          <w:rFonts w:ascii="Arial" w:hAnsi="Arial"/>
+          <w:sz w:val="24"/>
+        </w:rPr>
+      </w:r>
+    </w:p>
+    <w:p>
+      <w:pPr>
+        <w:spacing w:line="360" w:lineRule="auto"/>
+      </w:pPr>
+      <w:r>
+        <w:rPr>
+          <w:rFonts w:ascii="Arial" w:hAnsi="Arial"/>
+          <w:sz w:val="24"/>
+        </w:rPr>
+        <w:t>The Charity Events API exposes four RESTful GET endpoints:</w:t>
+      </w:r>
+    </w:p>
+    <w:p>
+      <w:pPr>
+        <w:spacing w:line="360" w:lineRule="auto"/>
+      </w:pPr>
+      <w:r>
+        <w:rPr>
+          <w:rFonts w:ascii="Arial" w:hAnsi="Arial"/>
+          <w:sz w:val="24"/>
+        </w:rPr>
+      </w:r>
+    </w:p>
     <w:p>
       <w:pPr>
         <w:spacing w:line="360" w:lineRule="auto"/>

</xml_diff>